<commit_message>
Restructure repo after sample layout; add README visuals, docs and scraper
- README rebuilt: problem statement, measured cost & damage model, news and
  research evidence (verified links), differentiation, results, layout, status
- assets/images + assets/generate_figures.py (numbers computed from data/cleaned)
- notebook charts moved to assets/figures
- docs/PROBLEM_STATEMENT.md, docs/DATA_COLLECTION.md, scraper/redbus_collector.js
- report: occupancy wording limited to redBus seat map (redBus reports 77% final
  occupancy); scraping-method wording corrected; reference [10] added
</commit_message>
<xml_diff>
--- a/Case_Study_Report.docx
+++ b/Case_Study_Report.docx
@@ -689,7 +689,7 @@
           <w:sz w:val="22"/>
           <w:szCs w:val="22"/>
         </w:rPr>
-        <w:t xml:space="preserve">Eight corridors were chosen to cover South, West and North India and a mix of short and overnight trips: Bengaluru-Chennai, Bengaluru-Hyderabad, Bengaluru-Coimbatore, Chennai-Coimbatore, Chennai-Madurai, Hyderabad-Vijayawada, Mumbai-Pune and Delhi-Jaipur. For each corridor, listings were collected for 13 departure dates at 1, 2, 3, 4, 5, 6, 7, 10, 14, 21, 30, 45 and 60 days after the scrape date (25 September 2026), which gives 104 route-date searches. The search page fills its results from a JSON endpoint that the site's own front end calls. The same endpoint was queried with paging of 100 results, so every listed bus was captured, not just the first screen. Government operators (APSRTC, TGSRTC, KSRTC, RSRTC and others) appear as collapsed groups on the page, so a second pass expanded each group. Plain script requests were refused by the site's bot protection, so the collector ran inside a normal browser session on the site, with a 1.2-1.5 second pause between requests. The collector code is kept in the notebook for reproducibility.</w:t>
+        <w:t xml:space="preserve">Eight corridors were chosen to cover South, West and North India and a mix of short and overnight trips: Bengaluru-Chennai, Bengaluru-Hyderabad, Bengaluru-Coimbatore, Chennai-Coimbatore, Chennai-Madurai, Hyderabad-Vijayawada, Mumbai-Pune and Delhi-Jaipur. For each corridor, listings were collected for 13 departure dates at 1, 2, 3, 4, 5, 6, 7, 10, 14, 21, 30, 45 and 60 days after the scrape date (25 September 2026), which gives 104 route-date searches. The search page fills its results from a JSON endpoint that the site's own front end calls. The same endpoint was queried with paging of 100 results, so every listed bus was captured, not just the first screen. Government operators (APSRTC, TGSRTC, KSRTC, RSRTC and others) appear as collapsed groups on the page, so a second pass expanded each group. Script requests (curl or Python) could not reach the site from the analysis environment, so the collector ran inside a normal browser session on the site, with a 1.2-1.5 second pause between requests. The collector code is kept in the notebook for reproducibility.</w:t>
       </w:r>
     </w:p>
     <w:p>
@@ -1152,7 +1152,7 @@
                 <w:sz w:val="18"/>
                 <w:szCs w:val="18"/>
               </w:rPr>
-              <w:t xml:space="preserve">Seats left, bus capacity, and share already sold (1 - available/total).</w:t>
+              <w:t xml:space="preserve">Seats left on redBus, bus capacity, and share of the redBus seat map already sold (1 - available/total).</w:t>
             </w:r>
           </w:p>
         </w:tc>
@@ -3963,7 +3963,7 @@
           <w:sz w:val="18"/>
           <w:szCs w:val="18"/>
         </w:rPr>
-        <w:t xml:space="preserve">Figure 3. Same-service fare index by days to departure (left) and share of seats already sold (right). Orange bands mark festival departure dates.</w:t>
+        <w:t xml:space="preserve">Figure 3. Same-service fare index by days to departure (left) and share of redBus seats already sold (right). Orange bands mark festival departure dates.</w:t>
       </w:r>
     </w:p>
     <w:p>
@@ -3977,7 +3977,7 @@
           <w:sz w:val="22"/>
           <w:szCs w:val="22"/>
         </w:rPr>
-        <w:t xml:space="preserve">The pattern is the opposite of the common belief that fares rise as departure nears. For private operators on ordinary dates, the median index stays at 100 from 60 days out to 5 days out, then falls to 80-89 in the final four days. On ordinary dates, private fares are 14.3% lower in the last four days than earlier. Occupancy explains why: even the day before departure the average bus is only 31% sold (12% sold 60 days out), so operators cut fares to fill empty seats. Government operators do not move at all (index 100 on every date). Festival departures are the exception: the median private fare on festival dates is 20% above normal, and up to 42% above normal for the Friday before Dussehra week.</w:t>
+        <w:t xml:space="preserve">The pattern is the opposite of the common belief that fares rise as departure nears. For private operators on ordinary dates, the median index stays at 100 from 60 days out to 5 days out, then falls to 80-89 in the final four days. On ordinary dates, private fares are 14.3% lower in the last four days than earlier. The seat maps point to the reason: the day before departure only 31% of the seats shown on redBus are sold on average (12% at 60 days out), so operators discount the seats still unsold online. This figure counts redBus inventory only; operators also sell through counters, agents and their own apps, and redBus reports 77% average final occupancy for October 2025 to March 2026 [10], so buses do not leave this empty. Government operators do not move at all (index 100 on every date). Festival departures are the exception: the median private fare on festival dates is 20% above normal, and up to 42% above normal for the Friday before Dussehra week.</w:t>
       </w:r>
     </w:p>
     <w:p>
@@ -10649,7 +10649,7 @@
           <w:sz w:val="22"/>
           <w:szCs w:val="22"/>
         </w:rPr>
-        <w:t xml:space="preserve">on ordinary dates, do not book private AC sleepers weeks ahead. Book 1-4 days before travel, when fares are about 14% lower and buses are still roughly 70-80% empty. Book festival and Friday departures early, when advance fares are the safer choice. Book government buses whenever convenient. A travel desk can apply these rules as policy and use the classifier to flag the exceptions.</w:t>
+        <w:t xml:space="preserve">on ordinary dates, do not book private AC sleepers weeks ahead. Book 1-4 days before travel, when fares are about 14% lower and most online seats are still unsold. Book festival and Friday departures early, when advance fares are the safer choice. Book government buses whenever convenient. A travel desk can apply these rules as policy and use the classifier to flag the exceptions.</w:t>
       </w:r>
     </w:p>
     <w:p>
@@ -10707,7 +10707,7 @@
           <w:sz w:val="22"/>
           <w:szCs w:val="22"/>
         </w:rPr>
-        <w:t xml:space="preserve">deep last-minute cuts show that advance pricing on ordinary dates is set too high for demand (buses are only 12-18% sold two weeks or more before departure). Lower early fares or early-bird tiers would fill seats sooner. The discounts also teach regular travellers to wait, so operators with flat pricing should track whether they lose late bookers to rivals that discount.</w:t>
+        <w:t xml:space="preserve">deep last-minute cuts show that advance pricing on ordinary dates is set too high for demand (only 12-18% of online seats are sold two weeks or more before departure). Lower early fares or early-bird tiers would fill seats sooner. The discounts also teach regular travellers to wait, so operators with flat pricing should track whether they lose late bookers to rivals that discount.</w:t>
       </w:r>
     </w:p>
     <w:p>
@@ -10734,7 +10734,7 @@
           <w:sz w:val="22"/>
           <w:szCs w:val="22"/>
         </w:rPr>
-        <w:t xml:space="preserve">Using 31,838 real redBus listings across eight corridors and a 60-day booking horizon, this study finds that intercity bus fares in India do not follow the airline-style pattern of rising prices as departure nears. For private operators on ordinary dates, the same bus is about 14% cheaper in the last four days, because buses depart largely empty and operators cut fares to fill them. Government fares are fixed. Festival departures carry a 20% or larger premium, and there the usual advice to book early does apply. A Random Forest predicts fares with R2 0.83 on log fare, and a Book Now / Wait classifier with ROC-AUC 0.89 turns these patterns into a usable buying signal. The objectives were met, and the main finding contradicts the intuition that motivated the study, which is the kind of correction evidence-based booking is meant to provide.</w:t>
+        <w:t xml:space="preserve">Using 31,838 real redBus listings across eight corridors and a 60-day booking horizon, this study finds that intercity bus fares in India do not follow the airline-style pattern of rising prices as departure nears. For private operators on ordinary dates, the same bus is about 14% cheaper in the last four days, because operators discount seats still unsold online close to departure. Government fares are fixed. Festival departures carry a 20% or larger premium, and there the usual advice to book early does apply. A Random Forest predicts fares with R2 0.83 on log fare, and a Book Now / Wait classifier with ROC-AUC 0.89 turns these patterns into a usable buying signal. The objectives were met, and the main finding contradicts the intuition that motivated the study, which is the kind of correction evidence-based booking is meant to provide.</w:t>
       </w:r>
     </w:p>
     <w:p>
@@ -10758,7 +10758,7 @@
           <w:sz w:val="22"/>
           <w:szCs w:val="22"/>
         </w:rPr>
-        <w:t xml:space="preserve">(1) All data comes from one scrape day, so the analysis compares different departure dates rather than following one departure's price over time; repeated daily scrapes would give a true longitudinal panel. (2) Near dates (26-29 Sep) and far dates differ in season, which the same-weekday comparisons reduce but cannot remove. (3) The starting fare is the cheapest seat, not the average seat. (4) Festival windows are defined by calendar, not measured demand; search-trend data as in [4] could improve this.</w:t>
+        <w:t xml:space="preserve">(1) All data comes from one scrape day, so the analysis compares different departure dates rather than following one departure's price over time; repeated daily scrapes would give a true longitudinal panel. (2) Near dates (26-29 Sep) and far dates differ in season, which the same-weekday comparisons reduce but cannot remove. (3) The starting fare is the cheapest seat, not the average seat. Occupancy is measured from the redBus seat map only, not the operator's full sales. (4) Festival windows are defined by calendar, not measured demand; search-trend data as in [4] could improve this.</w:t>
       </w:r>
     </w:p>
     <w:p>
@@ -10898,6 +10898,20 @@
           <w:szCs w:val="19"/>
         </w:rPr>
         <w:t xml:space="preserve">[9] L. Breiman, "Random forests," Machine Learning, vol. 45, no. 1, pp. 5-32, 2001.</w:t>
+      </w:r>
+    </w:p>
+    <w:p>
+      <w:pPr>
+        <w:spacing w:after="60"/>
+        <w:ind w:left="360" w:hanging="360"/>
+      </w:pPr>
+      <w:r>
+        <w:rPr>
+          <w:rFonts w:ascii="Calibri" w:cs="Calibri" w:eastAsia="Calibri" w:hAnsi="Calibri"/>
+          <w:sz w:val="19"/>
+          <w:szCs w:val="19"/>
+        </w:rPr>
+        <w:t xml:space="preserve">[10] Autocar Professional, "Intercity bus passenger volumes rise 24% in second half of FY2026: redBus report," 21 May 2026. https://www.autocarpro.in/news/intercity-bus-passenger-volumes-rise-24-percent-in-second-half-of-fy2026-redbus-report-132718</w:t>
       </w:r>
     </w:p>
     <w:sectPr>

</xml_diff>

<commit_message>
Report: remove scrape date
</commit_message>
<xml_diff>
--- a/Case_Study_Report.docx
+++ b/Case_Study_Report.docx
@@ -408,7 +408,7 @@
                 <w:sz w:val="18"/>
                 <w:szCs w:val="18"/>
               </w:rPr>
-              <w:t xml:space="preserve">redBus public search-results pages, scraped on 25 September 2026</w:t>
+              <w:t xml:space="preserve">redBus public search-results pages (web scraping)</w:t>
             </w:r>
           </w:p>
         </w:tc>
@@ -689,7 +689,7 @@
           <w:sz w:val="22"/>
           <w:szCs w:val="22"/>
         </w:rPr>
-        <w:t xml:space="preserve">Eight corridors were chosen to cover South, West and North India and a mix of short and overnight trips: Bengaluru-Chennai, Bengaluru-Hyderabad, Bengaluru-Coimbatore, Chennai-Coimbatore, Chennai-Madurai, Hyderabad-Vijayawada, Mumbai-Pune and Delhi-Jaipur. For each corridor, listings were collected for 13 departure dates at 1, 2, 3, 4, 5, 6, 7, 10, 14, 21, 30, 45 and 60 days after the scrape date (25 September 2026), which gives 104 route-date searches. The search page fills its results from a JSON endpoint that the site's own front end calls. The same endpoint was queried with paging of 100 results, so every listed bus was captured, not just the first screen. Government operators (APSRTC, TGSRTC, KSRTC, RSRTC and others) appear as collapsed groups on the page, so a second pass expanded each group. Script requests (curl or Python) could not reach the site from the analysis environment, so the collector ran inside a normal browser session on the site, with a 1.2-1.5 second pause between requests. The collector code is kept in the notebook for reproducibility.</w:t>
+        <w:t xml:space="preserve">Eight corridors were chosen to cover South, West and North India and a mix of short and overnight trips: Bengaluru-Chennai, Bengaluru-Hyderabad, Bengaluru-Coimbatore, Chennai-Coimbatore, Chennai-Madurai, Hyderabad-Vijayawada, Mumbai-Pune and Delhi-Jaipur. For each corridor, listings were collected for 13 departure dates at 1, 2, 3, 4, 5, 6, 7, 10, 14, 21, 30, 45 and 60 days after the scrape date, which gives 104 route-date searches. The search page fills its results from a JSON endpoint that the site's own front end calls. The same endpoint was queried with paging of 100 results, so every listed bus was captured, not just the first screen. Government operators (APSRTC, TGSRTC, KSRTC, RSRTC and others) appear as collapsed groups on the page, so a second pass expanded each group. Script requests (curl or Python) could not reach the site from the analysis environment, so the collector ran inside a normal browser session on the site, with a 1.2-1.5 second pause between requests. The collector code is kept in the notebook for reproducibility.</w:t>
       </w:r>
     </w:p>
     <w:p>
@@ -713,7 +713,7 @@
           <w:sz w:val="22"/>
           <w:szCs w:val="22"/>
         </w:rPr>
-        <w:t xml:space="preserve">The raw file (data/raw/bus_fares_raw_2026-09-25.csv) holds 32,372 listings with 19 attributes from 981 operators. One record is one bus service on sale for one route and departure date. After cleaning, 31,838 records remain (data/cleaned/bus_fares_clean.csv, 27 columns including derived features).</w:t>
+        <w:t xml:space="preserve">The raw file in data/raw/ holds 32,372 listings with 19 attributes from 981 operators. One record is one bus service on sale for one route and departure date. After cleaning, 31,838 records remain (data/cleaned/bus_fares_clean.csv, 27 columns including derived features).</w:t>
       </w:r>
     </w:p>
     <w:p>
@@ -10758,7 +10758,7 @@
           <w:sz w:val="22"/>
           <w:szCs w:val="22"/>
         </w:rPr>
-        <w:t xml:space="preserve">(1) All data comes from one scrape day, so the analysis compares different departure dates rather than following one departure's price over time; repeated daily scrapes would give a true longitudinal panel. (2) Near dates (26-29 Sep) and far dates differ in season, which the same-weekday comparisons reduce but cannot remove. (3) The starting fare is the cheapest seat, not the average seat. Occupancy is measured from the redBus seat map only, not the operator's full sales. (4) Festival windows are defined by calendar, not measured demand; search-trend data as in [4] could improve this.</w:t>
+        <w:t xml:space="preserve">(1) All data comes from one scrape day, so the analysis compares different departure dates rather than following one departure's price over time; repeated daily scrapes would give a true longitudinal panel. (2) Near and far departure dates differ in season, which the same-weekday comparisons reduce but cannot remove. (3) The starting fare is the cheapest seat, not the average seat. Occupancy is measured from the redBus seat map only, not the operator's full sales. (4) Festival windows are defined by calendar, not measured demand; search-trend data as in [4] could improve this.</w:t>
       </w:r>
     </w:p>
     <w:p>
@@ -10785,7 +10785,7 @@
           <w:sz w:val="19"/>
           <w:szCs w:val="19"/>
         </w:rPr>
-        <w:t xml:space="preserve">[1] redBus, "Bus ticket search results", https://www.redbus.in (data collected 25 Sep 2026).</w:t>
+        <w:t xml:space="preserve">[1] redBus, "Bus ticket search results", https://www.redbus.in.</w:t>
       </w:r>
     </w:p>
     <w:p>

</xml_diff>